<commit_message>
feat: correcciones del docente (planteamiento sin pregunta, objetivos concretos con imagen, aviso académico) y mapa QGIS con cuadrícula y membrete
Co-Authored-By: Claude Opus 5.5 <noreply@anthropic.com>
</commit_message>
<xml_diff>
--- a/docs/informe_proyecto.docx
+++ b/docs/informe_proyecto.docx
@@ -84,6 +84,11 @@
         <w:t>Jessica Jaqueline Haro Simba</w:t>
       </w:r>
     </w:p>
+    <w:p>
+      <w:r>
+        <w:t>Jhonattan Sebastián Ligña Hernández</w:t>
+      </w:r>
+    </w:p>
     <w:p/>
     <w:p>
       <w:r>
@@ -149,7 +154,7 @@
       <w:r>
         <w:fldChar w:fldCharType="separate"/>
       </w:r>
-      <w:hyperlink w:anchor="_Toc242992762" w:history="1">
+      <w:hyperlink w:anchor="_Toc243472964" w:history="1">
         <w:r>
           <w:rPr>
             <w:rStyle w:val="Hipervnculo"/>
@@ -176,7 +181,7 @@
             <w:noProof/>
             <w:webHidden/>
           </w:rPr>
-          <w:instrText xml:space="preserve"> PAGEREF _Toc242992762 \h </w:instrText>
+          <w:instrText xml:space="preserve"> PAGEREF _Toc243472964 \h </w:instrText>
         </w:r>
         <w:r>
           <w:rPr>
@@ -217,7 +222,7 @@
           <w:noProof/>
         </w:rPr>
       </w:pPr>
-      <w:hyperlink w:anchor="_Toc242992763" w:history="1">
+      <w:hyperlink w:anchor="_Toc243472965" w:history="1">
         <w:r>
           <w:rPr>
             <w:rStyle w:val="Hipervnculo"/>
@@ -244,7 +249,7 @@
             <w:noProof/>
             <w:webHidden/>
           </w:rPr>
-          <w:instrText xml:space="preserve"> PAGEREF _Toc242992763 \h </w:instrText>
+          <w:instrText xml:space="preserve"> PAGEREF _Toc243472965 \h </w:instrText>
         </w:r>
         <w:r>
           <w:rPr>
@@ -285,7 +290,7 @@
           <w:noProof/>
         </w:rPr>
       </w:pPr>
-      <w:hyperlink w:anchor="_Toc242992764" w:history="1">
+      <w:hyperlink w:anchor="_Toc243472966" w:history="1">
         <w:r>
           <w:rPr>
             <w:rStyle w:val="Hipervnculo"/>
@@ -312,7 +317,7 @@
             <w:noProof/>
             <w:webHidden/>
           </w:rPr>
-          <w:instrText xml:space="preserve"> PAGEREF _Toc242992764 \h </w:instrText>
+          <w:instrText xml:space="preserve"> PAGEREF _Toc243472966 \h </w:instrText>
         </w:r>
         <w:r>
           <w:rPr>
@@ -353,7 +358,7 @@
           <w:noProof/>
         </w:rPr>
       </w:pPr>
-      <w:hyperlink w:anchor="_Toc242992765" w:history="1">
+      <w:hyperlink w:anchor="_Toc243472967" w:history="1">
         <w:r>
           <w:rPr>
             <w:rStyle w:val="Hipervnculo"/>
@@ -380,7 +385,7 @@
             <w:noProof/>
             <w:webHidden/>
           </w:rPr>
-          <w:instrText xml:space="preserve"> PAGEREF _Toc242992765 \h </w:instrText>
+          <w:instrText xml:space="preserve"> PAGEREF _Toc243472967 \h </w:instrText>
         </w:r>
         <w:r>
           <w:rPr>
@@ -421,7 +426,7 @@
           <w:noProof/>
         </w:rPr>
       </w:pPr>
-      <w:hyperlink w:anchor="_Toc242992766" w:history="1">
+      <w:hyperlink w:anchor="_Toc243472968" w:history="1">
         <w:r>
           <w:rPr>
             <w:rStyle w:val="Hipervnculo"/>
@@ -448,7 +453,7 @@
             <w:noProof/>
             <w:webHidden/>
           </w:rPr>
-          <w:instrText xml:space="preserve"> PAGEREF _Toc242992766 \h </w:instrText>
+          <w:instrText xml:space="preserve"> PAGEREF _Toc243472968 \h </w:instrText>
         </w:r>
         <w:r>
           <w:rPr>
@@ -489,7 +494,7 @@
           <w:noProof/>
         </w:rPr>
       </w:pPr>
-      <w:hyperlink w:anchor="_Toc242992767" w:history="1">
+      <w:hyperlink w:anchor="_Toc243472969" w:history="1">
         <w:r>
           <w:rPr>
             <w:rStyle w:val="Hipervnculo"/>
@@ -516,7 +521,7 @@
             <w:noProof/>
             <w:webHidden/>
           </w:rPr>
-          <w:instrText xml:space="preserve"> PAGEREF _Toc242992767 \h </w:instrText>
+          <w:instrText xml:space="preserve"> PAGEREF _Toc243472969 \h </w:instrText>
         </w:r>
         <w:r>
           <w:rPr>
@@ -557,7 +562,7 @@
           <w:noProof/>
         </w:rPr>
       </w:pPr>
-      <w:hyperlink w:anchor="_Toc242992768" w:history="1">
+      <w:hyperlink w:anchor="_Toc243472970" w:history="1">
         <w:r>
           <w:rPr>
             <w:rStyle w:val="Hipervnculo"/>
@@ -584,7 +589,7 @@
             <w:noProof/>
             <w:webHidden/>
           </w:rPr>
-          <w:instrText xml:space="preserve"> PAGEREF _Toc242992768 \h </w:instrText>
+          <w:instrText xml:space="preserve"> PAGEREF _Toc243472970 \h </w:instrText>
         </w:r>
         <w:r>
           <w:rPr>
@@ -625,7 +630,7 @@
           <w:noProof/>
         </w:rPr>
       </w:pPr>
-      <w:hyperlink w:anchor="_Toc242992769" w:history="1">
+      <w:hyperlink w:anchor="_Toc243472971" w:history="1">
         <w:r>
           <w:rPr>
             <w:rStyle w:val="Hipervnculo"/>
@@ -652,7 +657,7 @@
             <w:noProof/>
             <w:webHidden/>
           </w:rPr>
-          <w:instrText xml:space="preserve"> PAGEREF _Toc242992769 \h </w:instrText>
+          <w:instrText xml:space="preserve"> PAGEREF _Toc243472971 \h </w:instrText>
         </w:r>
         <w:r>
           <w:rPr>
@@ -693,7 +698,7 @@
           <w:noProof/>
         </w:rPr>
       </w:pPr>
-      <w:hyperlink w:anchor="_Toc242992770" w:history="1">
+      <w:hyperlink w:anchor="_Toc243472972" w:history="1">
         <w:r>
           <w:rPr>
             <w:rStyle w:val="Hipervnculo"/>
@@ -720,7 +725,7 @@
             <w:noProof/>
             <w:webHidden/>
           </w:rPr>
-          <w:instrText xml:space="preserve"> PAGEREF _Toc242992770 \h </w:instrText>
+          <w:instrText xml:space="preserve"> PAGEREF _Toc243472972 \h </w:instrText>
         </w:r>
         <w:r>
           <w:rPr>
@@ -761,7 +766,7 @@
           <w:noProof/>
         </w:rPr>
       </w:pPr>
-      <w:hyperlink w:anchor="_Toc242992771" w:history="1">
+      <w:hyperlink w:anchor="_Toc243472973" w:history="1">
         <w:r>
           <w:rPr>
             <w:rStyle w:val="Hipervnculo"/>
@@ -788,7 +793,7 @@
             <w:noProof/>
             <w:webHidden/>
           </w:rPr>
-          <w:instrText xml:space="preserve"> PAGEREF _Toc242992771 \h </w:instrText>
+          <w:instrText xml:space="preserve"> PAGEREF _Toc243472973 \h </w:instrText>
         </w:r>
         <w:r>
           <w:rPr>
@@ -829,7 +834,7 @@
           <w:noProof/>
         </w:rPr>
       </w:pPr>
-      <w:hyperlink w:anchor="_Toc242992772" w:history="1">
+      <w:hyperlink w:anchor="_Toc243472974" w:history="1">
         <w:r>
           <w:rPr>
             <w:rStyle w:val="Hipervnculo"/>
@@ -856,7 +861,7 @@
             <w:noProof/>
             <w:webHidden/>
           </w:rPr>
-          <w:instrText xml:space="preserve"> PAGEREF _Toc242992772 \h </w:instrText>
+          <w:instrText xml:space="preserve"> PAGEREF _Toc243472974 \h </w:instrText>
         </w:r>
         <w:r>
           <w:rPr>
@@ -897,7 +902,7 @@
           <w:noProof/>
         </w:rPr>
       </w:pPr>
-      <w:hyperlink w:anchor="_Toc242992773" w:history="1">
+      <w:hyperlink w:anchor="_Toc243472975" w:history="1">
         <w:r>
           <w:rPr>
             <w:rStyle w:val="Hipervnculo"/>
@@ -924,7 +929,7 @@
             <w:noProof/>
             <w:webHidden/>
           </w:rPr>
-          <w:instrText xml:space="preserve"> PAGEREF _Toc242992773 \h </w:instrText>
+          <w:instrText xml:space="preserve"> PAGEREF _Toc243472975 \h </w:instrText>
         </w:r>
         <w:r>
           <w:rPr>
@@ -965,7 +970,7 @@
           <w:noProof/>
         </w:rPr>
       </w:pPr>
-      <w:hyperlink w:anchor="_Toc242992774" w:history="1">
+      <w:hyperlink w:anchor="_Toc243472976" w:history="1">
         <w:r>
           <w:rPr>
             <w:rStyle w:val="Hipervnculo"/>
@@ -992,7 +997,7 @@
             <w:noProof/>
             <w:webHidden/>
           </w:rPr>
-          <w:instrText xml:space="preserve"> PAGEREF _Toc242992774 \h </w:instrText>
+          <w:instrText xml:space="preserve"> PAGEREF _Toc243472976 \h </w:instrText>
         </w:r>
         <w:r>
           <w:rPr>
@@ -1033,7 +1038,7 @@
           <w:noProof/>
         </w:rPr>
       </w:pPr>
-      <w:hyperlink w:anchor="_Toc242992775" w:history="1">
+      <w:hyperlink w:anchor="_Toc243472977" w:history="1">
         <w:r>
           <w:rPr>
             <w:rStyle w:val="Hipervnculo"/>
@@ -1060,7 +1065,7 @@
             <w:noProof/>
             <w:webHidden/>
           </w:rPr>
-          <w:instrText xml:space="preserve"> PAGEREF _Toc242992775 \h </w:instrText>
+          <w:instrText xml:space="preserve"> PAGEREF _Toc243472977 \h </w:instrText>
         </w:r>
         <w:r>
           <w:rPr>
@@ -1101,7 +1106,7 @@
           <w:noProof/>
         </w:rPr>
       </w:pPr>
-      <w:hyperlink w:anchor="_Toc242992776" w:history="1">
+      <w:hyperlink w:anchor="_Toc243472978" w:history="1">
         <w:r>
           <w:rPr>
             <w:rStyle w:val="Hipervnculo"/>
@@ -1128,7 +1133,7 @@
             <w:noProof/>
             <w:webHidden/>
           </w:rPr>
-          <w:instrText xml:space="preserve"> PAGEREF _Toc242992776 \h </w:instrText>
+          <w:instrText xml:space="preserve"> PAGEREF _Toc243472978 \h </w:instrText>
         </w:r>
         <w:r>
           <w:rPr>
@@ -1169,7 +1174,7 @@
           <w:noProof/>
         </w:rPr>
       </w:pPr>
-      <w:hyperlink w:anchor="_Toc242992777" w:history="1">
+      <w:hyperlink w:anchor="_Toc243472979" w:history="1">
         <w:r>
           <w:rPr>
             <w:rStyle w:val="Hipervnculo"/>
@@ -1196,7 +1201,7 @@
             <w:noProof/>
             <w:webHidden/>
           </w:rPr>
-          <w:instrText xml:space="preserve"> PAGEREF _Toc242992777 \h </w:instrText>
+          <w:instrText xml:space="preserve"> PAGEREF _Toc243472979 \h </w:instrText>
         </w:r>
         <w:r>
           <w:rPr>
@@ -1237,7 +1242,7 @@
           <w:noProof/>
         </w:rPr>
       </w:pPr>
-      <w:hyperlink w:anchor="_Toc242992778" w:history="1">
+      <w:hyperlink w:anchor="_Toc243472980" w:history="1">
         <w:r>
           <w:rPr>
             <w:rStyle w:val="Hipervnculo"/>
@@ -1264,7 +1269,7 @@
             <w:noProof/>
             <w:webHidden/>
           </w:rPr>
-          <w:instrText xml:space="preserve"> PAGEREF _Toc242992778 \h </w:instrText>
+          <w:instrText xml:space="preserve"> PAGEREF _Toc243472980 \h </w:instrText>
         </w:r>
         <w:r>
           <w:rPr>
@@ -1305,7 +1310,7 @@
           <w:noProof/>
         </w:rPr>
       </w:pPr>
-      <w:hyperlink w:anchor="_Toc242992779" w:history="1">
+      <w:hyperlink w:anchor="_Toc243472981" w:history="1">
         <w:r>
           <w:rPr>
             <w:rStyle w:val="Hipervnculo"/>
@@ -1332,7 +1337,7 @@
             <w:noProof/>
             <w:webHidden/>
           </w:rPr>
-          <w:instrText xml:space="preserve"> PAGEREF _Toc242992779 \h </w:instrText>
+          <w:instrText xml:space="preserve"> PAGEREF _Toc243472981 \h </w:instrText>
         </w:r>
         <w:r>
           <w:rPr>
@@ -1373,7 +1378,7 @@
           <w:noProof/>
         </w:rPr>
       </w:pPr>
-      <w:hyperlink w:anchor="_Toc242992780" w:history="1">
+      <w:hyperlink w:anchor="_Toc243472982" w:history="1">
         <w:r>
           <w:rPr>
             <w:rStyle w:val="Hipervnculo"/>
@@ -1400,7 +1405,7 @@
             <w:noProof/>
             <w:webHidden/>
           </w:rPr>
-          <w:instrText xml:space="preserve"> PAGEREF _Toc242992780 \h </w:instrText>
+          <w:instrText xml:space="preserve"> PAGEREF _Toc243472982 \h </w:instrText>
         </w:r>
         <w:r>
           <w:rPr>
@@ -1441,7 +1446,7 @@
           <w:noProof/>
         </w:rPr>
       </w:pPr>
-      <w:hyperlink w:anchor="_Toc242992781" w:history="1">
+      <w:hyperlink w:anchor="_Toc243472983" w:history="1">
         <w:r>
           <w:rPr>
             <w:rStyle w:val="Hipervnculo"/>
@@ -1468,7 +1473,7 @@
             <w:noProof/>
             <w:webHidden/>
           </w:rPr>
-          <w:instrText xml:space="preserve"> PAGEREF _Toc242992781 \h </w:instrText>
+          <w:instrText xml:space="preserve"> PAGEREF _Toc243472983 \h </w:instrText>
         </w:r>
         <w:r>
           <w:rPr>
@@ -1509,7 +1514,7 @@
           <w:noProof/>
         </w:rPr>
       </w:pPr>
-      <w:hyperlink w:anchor="_Toc242992782" w:history="1">
+      <w:hyperlink w:anchor="_Toc243472984" w:history="1">
         <w:r>
           <w:rPr>
             <w:rStyle w:val="Hipervnculo"/>
@@ -1536,7 +1541,7 @@
             <w:noProof/>
             <w:webHidden/>
           </w:rPr>
-          <w:instrText xml:space="preserve"> PAGEREF _Toc242992782 \h </w:instrText>
+          <w:instrText xml:space="preserve"> PAGEREF _Toc243472984 \h </w:instrText>
         </w:r>
         <w:r>
           <w:rPr>
@@ -1577,7 +1582,7 @@
           <w:noProof/>
         </w:rPr>
       </w:pPr>
-      <w:hyperlink w:anchor="_Toc242992783" w:history="1">
+      <w:hyperlink w:anchor="_Toc243472985" w:history="1">
         <w:r>
           <w:rPr>
             <w:rStyle w:val="Hipervnculo"/>
@@ -1604,7 +1609,7 @@
             <w:noProof/>
             <w:webHidden/>
           </w:rPr>
-          <w:instrText xml:space="preserve"> PAGEREF _Toc242992783 \h </w:instrText>
+          <w:instrText xml:space="preserve"> PAGEREF _Toc243472985 \h </w:instrText>
         </w:r>
         <w:r>
           <w:rPr>
@@ -1645,7 +1650,7 @@
           <w:noProof/>
         </w:rPr>
       </w:pPr>
-      <w:hyperlink w:anchor="_Toc242992784" w:history="1">
+      <w:hyperlink w:anchor="_Toc243472986" w:history="1">
         <w:r>
           <w:rPr>
             <w:rStyle w:val="Hipervnculo"/>
@@ -1672,7 +1677,7 @@
             <w:noProof/>
             <w:webHidden/>
           </w:rPr>
-          <w:instrText xml:space="preserve"> PAGEREF _Toc242992784 \h </w:instrText>
+          <w:instrText xml:space="preserve"> PAGEREF _Toc243472986 \h </w:instrText>
         </w:r>
         <w:r>
           <w:rPr>
@@ -1713,7 +1718,7 @@
           <w:noProof/>
         </w:rPr>
       </w:pPr>
-      <w:hyperlink w:anchor="_Toc242992785" w:history="1">
+      <w:hyperlink w:anchor="_Toc243472987" w:history="1">
         <w:r>
           <w:rPr>
             <w:rStyle w:val="Hipervnculo"/>
@@ -1740,7 +1745,7 @@
             <w:noProof/>
             <w:webHidden/>
           </w:rPr>
-          <w:instrText xml:space="preserve"> PAGEREF _Toc242992785 \h </w:instrText>
+          <w:instrText xml:space="preserve"> PAGEREF _Toc243472987 \h </w:instrText>
         </w:r>
         <w:r>
           <w:rPr>
@@ -1781,7 +1786,7 @@
           <w:noProof/>
         </w:rPr>
       </w:pPr>
-      <w:hyperlink w:anchor="_Toc242992786" w:history="1">
+      <w:hyperlink w:anchor="_Toc243472988" w:history="1">
         <w:r>
           <w:rPr>
             <w:rStyle w:val="Hipervnculo"/>
@@ -1808,7 +1813,7 @@
             <w:noProof/>
             <w:webHidden/>
           </w:rPr>
-          <w:instrText xml:space="preserve"> PAGEREF _Toc242992786 \h </w:instrText>
+          <w:instrText xml:space="preserve"> PAGEREF _Toc243472988 \h </w:instrText>
         </w:r>
         <w:r>
           <w:rPr>
@@ -1849,7 +1854,7 @@
           <w:noProof/>
         </w:rPr>
       </w:pPr>
-      <w:hyperlink w:anchor="_Toc242992787" w:history="1">
+      <w:hyperlink w:anchor="_Toc243472989" w:history="1">
         <w:r>
           <w:rPr>
             <w:rStyle w:val="Hipervnculo"/>
@@ -1876,7 +1881,7 @@
             <w:noProof/>
             <w:webHidden/>
           </w:rPr>
-          <w:instrText xml:space="preserve"> PAGEREF _Toc242992787 \h </w:instrText>
+          <w:instrText xml:space="preserve"> PAGEREF _Toc243472989 \h </w:instrText>
         </w:r>
         <w:r>
           <w:rPr>
@@ -1917,7 +1922,7 @@
           <w:noProof/>
         </w:rPr>
       </w:pPr>
-      <w:hyperlink w:anchor="_Toc242992788" w:history="1">
+      <w:hyperlink w:anchor="_Toc243472990" w:history="1">
         <w:r>
           <w:rPr>
             <w:rStyle w:val="Hipervnculo"/>
@@ -1944,7 +1949,7 @@
             <w:noProof/>
             <w:webHidden/>
           </w:rPr>
-          <w:instrText xml:space="preserve"> PAGEREF _Toc242992788 \h </w:instrText>
+          <w:instrText xml:space="preserve"> PAGEREF _Toc243472990 \h </w:instrText>
         </w:r>
         <w:r>
           <w:rPr>
@@ -1985,7 +1990,7 @@
           <w:noProof/>
         </w:rPr>
       </w:pPr>
-      <w:hyperlink w:anchor="_Toc242992789" w:history="1">
+      <w:hyperlink w:anchor="_Toc243472991" w:history="1">
         <w:r>
           <w:rPr>
             <w:rStyle w:val="Hipervnculo"/>
@@ -2012,7 +2017,7 @@
             <w:noProof/>
             <w:webHidden/>
           </w:rPr>
-          <w:instrText xml:space="preserve"> PAGEREF _Toc242992789 \h </w:instrText>
+          <w:instrText xml:space="preserve"> PAGEREF _Toc243472991 \h </w:instrText>
         </w:r>
         <w:r>
           <w:rPr>
@@ -2053,7 +2058,7 @@
           <w:noProof/>
         </w:rPr>
       </w:pPr>
-      <w:hyperlink w:anchor="_Toc242992790" w:history="1">
+      <w:hyperlink w:anchor="_Toc243472992" w:history="1">
         <w:r>
           <w:rPr>
             <w:rStyle w:val="Hipervnculo"/>
@@ -2080,7 +2085,7 @@
             <w:noProof/>
             <w:webHidden/>
           </w:rPr>
-          <w:instrText xml:space="preserve"> PAGEREF _Toc242992790 \h </w:instrText>
+          <w:instrText xml:space="preserve"> PAGEREF _Toc243472992 \h </w:instrText>
         </w:r>
         <w:r>
           <w:rPr>
@@ -2121,7 +2126,7 @@
           <w:noProof/>
         </w:rPr>
       </w:pPr>
-      <w:hyperlink w:anchor="_Toc242992791" w:history="1">
+      <w:hyperlink w:anchor="_Toc243472993" w:history="1">
         <w:r>
           <w:rPr>
             <w:rStyle w:val="Hipervnculo"/>
@@ -2148,7 +2153,7 @@
             <w:noProof/>
             <w:webHidden/>
           </w:rPr>
-          <w:instrText xml:space="preserve"> PAGEREF _Toc242992791 \h </w:instrText>
+          <w:instrText xml:space="preserve"> PAGEREF _Toc243472993 \h </w:instrText>
         </w:r>
         <w:r>
           <w:rPr>
@@ -2189,7 +2194,7 @@
           <w:noProof/>
         </w:rPr>
       </w:pPr>
-      <w:hyperlink w:anchor="_Toc242992792" w:history="1">
+      <w:hyperlink w:anchor="_Toc243472994" w:history="1">
         <w:r>
           <w:rPr>
             <w:rStyle w:val="Hipervnculo"/>
@@ -2216,7 +2221,7 @@
             <w:noProof/>
             <w:webHidden/>
           </w:rPr>
-          <w:instrText xml:space="preserve"> PAGEREF _Toc242992792 \h </w:instrText>
+          <w:instrText xml:space="preserve"> PAGEREF _Toc243472994 \h </w:instrText>
         </w:r>
         <w:r>
           <w:rPr>
@@ -2257,7 +2262,7 @@
           <w:noProof/>
         </w:rPr>
       </w:pPr>
-      <w:hyperlink w:anchor="_Toc242992793" w:history="1">
+      <w:hyperlink w:anchor="_Toc243472995" w:history="1">
         <w:r>
           <w:rPr>
             <w:rStyle w:val="Hipervnculo"/>
@@ -2284,7 +2289,7 @@
             <w:noProof/>
             <w:webHidden/>
           </w:rPr>
-          <w:instrText xml:space="preserve"> PAGEREF _Toc242992793 \h </w:instrText>
+          <w:instrText xml:space="preserve"> PAGEREF _Toc243472995 \h </w:instrText>
         </w:r>
         <w:r>
           <w:rPr>
@@ -2325,7 +2330,7 @@
         <w:pStyle w:val="Ttulo1"/>
         <w:pageBreakBefore/>
       </w:pPr>
-      <w:bookmarkStart w:id="0" w:name="_Toc242992762"/>
+      <w:bookmarkStart w:id="0" w:name="_Toc243472964"/>
       <w:r>
         <w:lastRenderedPageBreak/>
         <w:t>Guía rápida para el equipo</w:t>
@@ -2341,7 +2346,7 @@
       <w:pPr>
         <w:pStyle w:val="Ttulo2"/>
       </w:pPr>
-      <w:bookmarkStart w:id="1" w:name="_Toc242992763"/>
+      <w:bookmarkStart w:id="1" w:name="_Toc243472965"/>
       <w:r>
         <w:t>Dónde está cada cosa</w:t>
       </w:r>
@@ -2742,7 +2747,7 @@
       <w:pPr>
         <w:pStyle w:val="Ttulo2"/>
       </w:pPr>
-      <w:bookmarkStart w:id="2" w:name="_Toc242992764"/>
+      <w:bookmarkStart w:id="2" w:name="_Toc243472966"/>
       <w:r>
         <w:t>Qué tiene la página web</w:t>
       </w:r>
@@ -2759,7 +2764,7 @@
         <w:t xml:space="preserve">Inicio: </w:t>
       </w:r>
       <w:r>
-        <w:t>introducción, planteamiento del problema, mapa de ubicación (QGIS, Python e interactivo) y objetivos.</w:t>
+        <w:t>planteamiento del problema (importancia, uso de la estadística y caso de estudio), mapa de ubicación (QGIS, Python e interactivo) y objetivos (general y tres específicos).</w:t>
       </w:r>
     </w:p>
     <w:p>
@@ -2822,7 +2827,7 @@
       <w:pPr>
         <w:pStyle w:val="Ttulo2"/>
       </w:pPr>
-      <w:bookmarkStart w:id="3" w:name="_Toc242992765"/>
+      <w:bookmarkStart w:id="3" w:name="_Toc243472967"/>
       <w:r>
         <w:t>Estado por lección</w:t>
       </w:r>
@@ -2931,7 +2936,7 @@
               <w:rPr>
                 <w:sz w:val="18"/>
               </w:rPr>
-              <w:t>introducción, problema, objetivos; población, individuo y muestra</w:t>
+              <w:t>problema, objetivos; población, individuo y muestra</w:t>
             </w:r>
           </w:p>
         </w:tc>
@@ -3280,7 +3285,7 @@
       <w:pPr>
         <w:pStyle w:val="Ttulo2"/>
       </w:pPr>
-      <w:bookmarkStart w:id="4" w:name="_Toc242992766"/>
+      <w:bookmarkStart w:id="4" w:name="_Toc243472968"/>
       <w:r>
         <w:lastRenderedPageBreak/>
         <w:t>Cinco ideas clave para la exposición</w:t>
@@ -3361,7 +3366,7 @@
       <w:pPr>
         <w:pStyle w:val="Ttulo2"/>
       </w:pPr>
-      <w:bookmarkStart w:id="5" w:name="_Toc242992767"/>
+      <w:bookmarkStart w:id="5" w:name="_Toc243472969"/>
       <w:r>
         <w:t>Cómo trabajar con los archivos en tu computadora</w:t>
       </w:r>
@@ -3404,7 +3409,7 @@
       <w:pPr>
         <w:pStyle w:val="Ttulo2"/>
       </w:pPr>
-      <w:bookmarkStart w:id="6" w:name="_Toc242992768"/>
+      <w:bookmarkStart w:id="6" w:name="_Toc243472970"/>
       <w:r>
         <w:t>Glosario</w:t>
       </w:r>
@@ -3921,7 +3926,7 @@
       <w:pPr>
         <w:pStyle w:val="Ttulo1"/>
       </w:pPr>
-      <w:bookmarkStart w:id="7" w:name="_Toc242992769"/>
+      <w:bookmarkStart w:id="7" w:name="_Toc243472971"/>
       <w:r>
         <w:lastRenderedPageBreak/>
         <w:t>Parte I. La base de datos</w:t>
@@ -3932,7 +3937,7 @@
       <w:pPr>
         <w:pStyle w:val="Ttulo2"/>
       </w:pPr>
-      <w:bookmarkStart w:id="8" w:name="_Toc242992770"/>
+      <w:bookmarkStart w:id="8" w:name="_Toc243472972"/>
       <w:r>
         <w:t>1. Qué es esta base</w:t>
       </w:r>
@@ -3961,7 +3966,7 @@
       <w:pPr>
         <w:pStyle w:val="Ttulo2"/>
       </w:pPr>
-      <w:bookmarkStart w:id="9" w:name="_Toc242992771"/>
+      <w:bookmarkStart w:id="9" w:name="_Toc243472973"/>
       <w:r>
         <w:t>2. De dónde salieron los datos</w:t>
       </w:r>
@@ -4032,7 +4037,7 @@
       <w:pPr>
         <w:pStyle w:val="Ttulo2"/>
       </w:pPr>
-      <w:bookmarkStart w:id="10" w:name="_Toc242992772"/>
+      <w:bookmarkStart w:id="10" w:name="_Toc243472974"/>
       <w:r>
         <w:t>3. Cómo se preparó</w:t>
       </w:r>
@@ -4104,7 +4109,7 @@
       <w:pPr>
         <w:pStyle w:val="Ttulo2"/>
       </w:pPr>
-      <w:bookmarkStart w:id="11" w:name="_Toc242992773"/>
+      <w:bookmarkStart w:id="11" w:name="_Toc243472975"/>
       <w:r>
         <w:t>4. Variables</w:t>
       </w:r>
@@ -4937,7 +4942,7 @@
       <w:pPr>
         <w:pStyle w:val="Ttulo2"/>
       </w:pPr>
-      <w:bookmarkStart w:id="12" w:name="_Toc242992774"/>
+      <w:bookmarkStart w:id="12" w:name="_Toc243472976"/>
       <w:r>
         <w:lastRenderedPageBreak/>
         <w:t>5. Requisitos del trabajo</w:t>
@@ -5184,7 +5189,7 @@
       <w:pPr>
         <w:pStyle w:val="Ttulo2"/>
       </w:pPr>
-      <w:bookmarkStart w:id="13" w:name="_Toc242992775"/>
+      <w:bookmarkStart w:id="13" w:name="_Toc243472977"/>
       <w:r>
         <w:t>6. Limitaciones que conviene conocer</w:t>
       </w:r>
@@ -5238,7 +5243,7 @@
       <w:pPr>
         <w:pStyle w:val="Ttulo2"/>
       </w:pPr>
-      <w:bookmarkStart w:id="14" w:name="_Toc242992776"/>
+      <w:bookmarkStart w:id="14" w:name="_Toc243472978"/>
       <w:r>
         <w:t>7. Acceso y cita</w:t>
       </w:r>
@@ -5279,7 +5284,7 @@
       <w:pPr>
         <w:pStyle w:val="Ttulo1"/>
       </w:pPr>
-      <w:bookmarkStart w:id="15" w:name="_Toc242992777"/>
+      <w:bookmarkStart w:id="15" w:name="_Toc243472979"/>
       <w:r>
         <w:lastRenderedPageBreak/>
         <w:t>Parte II. Estadística descriptiva</w:t>
@@ -5295,7 +5300,7 @@
       <w:pPr>
         <w:pStyle w:val="Ttulo2"/>
       </w:pPr>
-      <w:bookmarkStart w:id="16" w:name="_Toc242992778"/>
+      <w:bookmarkStart w:id="16" w:name="_Toc243472980"/>
       <w:r>
         <w:t>8. Por qué no sirvió la agrupación por defecto</w:t>
       </w:r>
@@ -5315,7 +5320,7 @@
           <w:noProof/>
         </w:rPr>
         <w:drawing>
-          <wp:inline distT="0" distB="0" distL="0" distR="0" wp14:anchorId="77FD002B" wp14:editId="3FFC599F">
+          <wp:inline distT="0" distB="0" distL="0" distR="0" wp14:anchorId="78388102" wp14:editId="2ABA2B81">
             <wp:extent cx="5760000" cy="2496000"/>
             <wp:effectExtent l="0" t="0" r="0" b="0"/>
             <wp:docPr id="1" name="Picture 1"/>
@@ -5368,7 +5373,7 @@
       <w:pPr>
         <w:pStyle w:val="Ttulo2"/>
       </w:pPr>
-      <w:bookmarkStart w:id="17" w:name="_Toc242992779"/>
+      <w:bookmarkStart w:id="17" w:name="_Toc243472981"/>
       <w:r>
         <w:t>9. Outliers: otras rocas, no errores</w:t>
       </w:r>
@@ -5392,7 +5397,7 @@
         </w:rPr>
         <w:lastRenderedPageBreak/>
         <w:drawing>
-          <wp:inline distT="0" distB="0" distL="0" distR="0" wp14:anchorId="4F070719" wp14:editId="5BA817DB">
+          <wp:inline distT="0" distB="0" distL="0" distR="0" wp14:anchorId="4323BE6B" wp14:editId="4D4CDE72">
             <wp:extent cx="5760000" cy="3840000"/>
             <wp:effectExtent l="0" t="0" r="0" b="0"/>
             <wp:docPr id="2" name="Picture 2"/>
@@ -5460,7 +5465,7 @@
       <w:pPr>
         <w:pStyle w:val="Ttulo2"/>
       </w:pPr>
-      <w:bookmarkStart w:id="18" w:name="_Toc242992780"/>
+      <w:bookmarkStart w:id="18" w:name="_Toc243472982"/>
       <w:r>
         <w:t>10. ¿Alcanzan los datos para las regresiones?</w:t>
       </w:r>
@@ -6328,7 +6333,7 @@
       <w:pPr>
         <w:pStyle w:val="Ttulo1"/>
       </w:pPr>
-      <w:bookmarkStart w:id="19" w:name="_Toc242992781"/>
+      <w:bookmarkStart w:id="19" w:name="_Toc243472983"/>
       <w:r>
         <w:lastRenderedPageBreak/>
         <w:t>Parte III. Cómo se construyó: documentación técnica</w:t>
@@ -6344,7 +6349,7 @@
       <w:pPr>
         <w:pStyle w:val="Ttulo2"/>
       </w:pPr>
-      <w:bookmarkStart w:id="20" w:name="_Toc242992782"/>
+      <w:bookmarkStart w:id="20" w:name="_Toc243472984"/>
       <w:r>
         <w:t>11. Arquitectura general</w:t>
       </w:r>
@@ -6537,7 +6542,7 @@
       <w:pPr>
         <w:pStyle w:val="Ttulo2"/>
       </w:pPr>
-      <w:bookmarkStart w:id="21" w:name="_Toc242992783"/>
+      <w:bookmarkStart w:id="21" w:name="_Toc243472985"/>
       <w:r>
         <w:t>12. Herramientas y librerías</w:t>
       </w:r>
@@ -7525,7 +7530,7 @@
       <w:pPr>
         <w:pStyle w:val="Ttulo2"/>
       </w:pPr>
-      <w:bookmarkStart w:id="22" w:name="_Toc242992784"/>
+      <w:bookmarkStart w:id="22" w:name="_Toc243472986"/>
       <w:r>
         <w:t>13. Limpieza de la base (scripts/limpiar.py)</w:t>
       </w:r>
@@ -7667,7 +7672,7 @@
       <w:pPr>
         <w:pStyle w:val="Ttulo2"/>
       </w:pPr>
-      <w:bookmarkStart w:id="23" w:name="_Toc242992785"/>
+      <w:bookmarkStart w:id="23" w:name="_Toc243472987"/>
       <w:r>
         <w:t>14. Mapa de ubicación (Python y QGIS)</w:t>
       </w:r>
@@ -7704,7 +7709,10 @@
         <w:t>scripts/proyecto_qgis.py</w:t>
       </w:r>
       <w:r>
-        <w:t xml:space="preserve"> se ejecuta con el Python que trae QGIS (PyQGIS). Carga las mismas capas, aplica una simbología categorizada con los mismos colores, arma una composición de impresión A4 y la exporta a PNG. El proyecto se guarda con rutas relativas, así que el .qgz funciona en cualquier computadora si está junto al .gpkg. Un detalle técnico: QGIS no logra ubicar etiquetas junto a los polos en la proyección Robinson, por eso las longitudes se rotulan sobre el ecuador.</w:t>
+        <w:t xml:space="preserve"> se ejecuta con el Python que trae QGIS (PyQGIS). Carga las mismas capas, aplica una simbología categorizada con los mismos colores, arma una composición de impresión A4 con el formato de la plantilla del docente y la exporta a PNG: marco, cuadrícula de 30° con las coordenadas en el borde, leyenda, norte, escala gráfica y membrete (logo UCE, facultad y carrera, proyección, datum, título, autores, fecha y escala). La composición usa coordenadas geográficas (EPSG:4326) para que la cuadrícula toque el marco en</w:t>
+      </w:r>
+      <w:r>
+        <w:t xml:space="preserve"> los cuatro lados. El proyecto se guarda con rutas relativas, así que el .qgz funciona en cualquier computadora si está junto al .gpkg y al logo.</w:t>
       </w:r>
     </w:p>
     <w:p>
@@ -7717,7 +7725,7 @@
         </w:rPr>
         <w:lastRenderedPageBreak/>
         <w:drawing>
-          <wp:inline distT="0" distB="0" distL="0" distR="0" wp14:anchorId="5AA81B3A" wp14:editId="7E2964C5">
+          <wp:inline distT="0" distB="0" distL="0" distR="0" wp14:anchorId="18FE9182" wp14:editId="7920F6C0">
             <wp:extent cx="5760000" cy="4073225"/>
             <wp:effectExtent l="0" t="0" r="0" b="0"/>
             <wp:docPr id="3" name="Picture 3"/>
@@ -7770,7 +7778,7 @@
       <w:pPr>
         <w:pStyle w:val="Ttulo2"/>
       </w:pPr>
-      <w:bookmarkStart w:id="24" w:name="_Toc242992786"/>
+      <w:bookmarkStart w:id="24" w:name="_Toc243472988"/>
       <w:r>
         <w:t>15. Estadística en R (carpeta R/)</w:t>
       </w:r>
@@ -7927,7 +7935,7 @@
       <w:pPr>
         <w:pStyle w:val="Ttulo2"/>
       </w:pPr>
-      <w:bookmarkStart w:id="25" w:name="_Toc242992787"/>
+      <w:bookmarkStart w:id="25" w:name="_Toc243472989"/>
       <w:r>
         <w:t>16. La página web</w:t>
       </w:r>
@@ -8030,7 +8038,7 @@
               <w:rPr>
                 <w:sz w:val="18"/>
               </w:rPr>
-              <w:t>portada, introducción, problema, mapa (con pestañas QGIS / Python / interactivo), objetivos</w:t>
+              <w:t>portada, problema, mapa (con pestañas QGIS / Python / interactivo), objetivos</w:t>
             </w:r>
           </w:p>
         </w:tc>
@@ -8051,7 +8059,6 @@
               <w:rPr>
                 <w:sz w:val="18"/>
               </w:rPr>
-              <w:lastRenderedPageBreak/>
               <w:t>docs/descriptiva/index.html</w:t>
             </w:r>
           </w:p>
@@ -8089,6 +8096,7 @@
               <w:rPr>
                 <w:sz w:val="18"/>
               </w:rPr>
+              <w:lastRenderedPageBreak/>
               <w:t>docs/datos/index.html</w:t>
             </w:r>
           </w:p>
@@ -8759,7 +8767,7 @@
       <w:pPr>
         <w:pStyle w:val="Ttulo2"/>
       </w:pPr>
-      <w:bookmarkStart w:id="26" w:name="_Toc242992788"/>
+      <w:bookmarkStart w:id="26" w:name="_Toc243472990"/>
       <w:r>
         <w:t>17. Publicación y control de versiones</w:t>
       </w:r>
@@ -8787,7 +8795,7 @@
       <w:pPr>
         <w:pStyle w:val="Ttulo2"/>
       </w:pPr>
-      <w:bookmarkStart w:id="27" w:name="_Toc242992789"/>
+      <w:bookmarkStart w:id="27" w:name="_Toc243472991"/>
       <w:r>
         <w:t>18. Documentación del proyecto</w:t>
       </w:r>
@@ -8867,7 +8875,7 @@
       <w:pPr>
         <w:pStyle w:val="Ttulo2"/>
       </w:pPr>
-      <w:bookmarkStart w:id="28" w:name="_Toc242992790"/>
+      <w:bookmarkStart w:id="28" w:name="_Toc243472992"/>
       <w:r>
         <w:lastRenderedPageBreak/>
         <w:t>19. Cómo reproducir todo</w:t>
@@ -9052,7 +9060,7 @@
       <w:pPr>
         <w:pStyle w:val="Ttulo2"/>
       </w:pPr>
-      <w:bookmarkStart w:id="29" w:name="_Toc242992791"/>
+      <w:bookmarkStart w:id="29" w:name="_Toc243472993"/>
       <w:r>
         <w:t>20. Limitaciones técnicas y mantenimiento</w:t>
       </w:r>
@@ -9107,7 +9115,7 @@
       <w:pPr>
         <w:pStyle w:val="Ttulo1"/>
       </w:pPr>
-      <w:bookmarkStart w:id="30" w:name="_Toc242992792"/>
+      <w:bookmarkStart w:id="30" w:name="_Toc243472994"/>
       <w:r>
         <w:lastRenderedPageBreak/>
         <w:t>Anexo A. Diccionario de variables</w:t>
@@ -13171,7 +13179,7 @@
       <w:pPr>
         <w:pStyle w:val="Ttulo1"/>
       </w:pPr>
-      <w:bookmarkStart w:id="31" w:name="_Toc242992793"/>
+      <w:bookmarkStart w:id="31" w:name="_Toc243472995"/>
       <w:r>
         <w:t>Anexo B. Estructura del repositorio</w:t>
       </w:r>
@@ -13625,31 +13633,31 @@
       </w:rPr>
     </w:lvl>
   </w:abstractNum>
-  <w:num w:numId="1" w16cid:durableId="529607741">
+  <w:num w:numId="1" w16cid:durableId="1793010356">
     <w:abstractNumId w:val="8"/>
   </w:num>
-  <w:num w:numId="2" w16cid:durableId="1641837195">
+  <w:num w:numId="2" w16cid:durableId="1638334508">
     <w:abstractNumId w:val="6"/>
   </w:num>
-  <w:num w:numId="3" w16cid:durableId="1663043389">
+  <w:num w:numId="3" w16cid:durableId="1340083768">
     <w:abstractNumId w:val="5"/>
   </w:num>
-  <w:num w:numId="4" w16cid:durableId="192572123">
+  <w:num w:numId="4" w16cid:durableId="1851985630">
     <w:abstractNumId w:val="4"/>
   </w:num>
-  <w:num w:numId="5" w16cid:durableId="1883247886">
+  <w:num w:numId="5" w16cid:durableId="892929037">
     <w:abstractNumId w:val="7"/>
   </w:num>
-  <w:num w:numId="6" w16cid:durableId="1115832117">
+  <w:num w:numId="6" w16cid:durableId="1548910470">
     <w:abstractNumId w:val="3"/>
   </w:num>
-  <w:num w:numId="7" w16cid:durableId="354038571">
+  <w:num w:numId="7" w16cid:durableId="748962809">
     <w:abstractNumId w:val="2"/>
   </w:num>
-  <w:num w:numId="8" w16cid:durableId="1245842650">
+  <w:num w:numId="8" w16cid:durableId="933976816">
     <w:abstractNumId w:val="1"/>
   </w:num>
-  <w:num w:numId="9" w16cid:durableId="1757551487">
+  <w:num w:numId="9" w16cid:durableId="365521778">
     <w:abstractNumId w:val="0"/>
   </w:num>
 </w:numbering>
@@ -25040,7 +25048,7 @@
     <w:autoRedefine/>
     <w:uiPriority w:val="39"/>
     <w:unhideWhenUsed/>
-    <w:rsid w:val="00B26720"/>
+    <w:rsid w:val="00ED53B2"/>
     <w:pPr>
       <w:spacing w:after="100"/>
     </w:pPr>
@@ -25052,7 +25060,7 @@
     <w:autoRedefine/>
     <w:uiPriority w:val="39"/>
     <w:unhideWhenUsed/>
-    <w:rsid w:val="00B26720"/>
+    <w:rsid w:val="00ED53B2"/>
     <w:pPr>
       <w:spacing w:after="100"/>
       <w:ind w:left="220"/>
@@ -25063,7 +25071,7 @@
     <w:basedOn w:val="Fuentedeprrafopredeter"/>
     <w:uiPriority w:val="99"/>
     <w:unhideWhenUsed/>
-    <w:rsid w:val="00B26720"/>
+    <w:rsid w:val="00ED53B2"/>
     <w:rPr>
       <w:color w:val="0000FF" w:themeColor="hyperlink"/>
       <w:u w:val="single"/>

</xml_diff>